<commit_message>
thêm phần vật cản
</commit_message>
<xml_diff>
--- a/AI.docx
+++ b/AI.docx
@@ -996,7 +996,21 @@
           <w:rFonts w:ascii="Times New Roman" w:hAnsi="Times New Roman" w:cs="Times New Roman"/>
           <w:lang w:val="vi-VN"/>
         </w:rPr>
-        <w:t>Là 1 kiểu agnet rất cơ bản</w:t>
+        <w:t xml:space="preserve">Là 1 kiểu </w:t>
+      </w:r>
+      <w:r>
+        <w:rPr>
+          <w:rFonts w:ascii="Times New Roman" w:hAnsi="Times New Roman" w:cs="Times New Roman"/>
+          <w:lang w:val="vi-VN"/>
+        </w:rPr>
+        <w:t>agen</w:t>
+      </w:r>
+      <w:r>
+        <w:rPr>
+          <w:rFonts w:ascii="Times New Roman" w:hAnsi="Times New Roman" w:cs="Times New Roman"/>
+          <w:lang w:val="vi-VN"/>
+        </w:rPr>
+        <w:t>t rất cơ bản</w:t>
       </w:r>
     </w:p>
     <w:p>
@@ -1184,6 +1198,64 @@
           <w:lang w:val="vi-VN"/>
         </w:rPr>
         <w:t>action</w:t>
+      </w:r>
+    </w:p>
+    <w:p>
+      <w:pPr>
+        <w:pStyle w:val="ListParagraph"/>
+        <w:rPr>
+          <w:rFonts w:ascii="Times New Roman" w:hAnsi="Times New Roman" w:cs="Times New Roman"/>
+          <w:lang w:val="vi-VN"/>
+        </w:rPr>
+      </w:pPr>
+    </w:p>
+    <w:p>
+      <w:pPr>
+        <w:pStyle w:val="ListParagraph"/>
+        <w:numPr>
+          <w:ilvl w:val="0"/>
+          <w:numId w:val="1"/>
+        </w:numPr>
+        <w:rPr>
+          <w:rFonts w:ascii="Times New Roman" w:hAnsi="Times New Roman" w:cs="Times New Roman"/>
+          <w:lang w:val="vi-VN"/>
+        </w:rPr>
+      </w:pPr>
+      <w:r>
+        <w:rPr>
+          <w:rFonts w:ascii="Times New Roman" w:hAnsi="Times New Roman" w:cs="Times New Roman"/>
+          <w:lang w:val="vi-VN"/>
+        </w:rPr>
+        <w:t>Máy hút bụi</w:t>
+      </w:r>
+    </w:p>
+    <w:p>
+      <w:pPr>
+        <w:pStyle w:val="ListParagraph"/>
+        <w:rPr>
+          <w:rFonts w:ascii="Times New Roman" w:hAnsi="Times New Roman" w:cs="Times New Roman"/>
+          <w:lang w:val="vi-VN"/>
+        </w:rPr>
+      </w:pPr>
+    </w:p>
+    <w:p>
+      <w:pPr>
+        <w:pStyle w:val="ListParagraph"/>
+        <w:numPr>
+          <w:ilvl w:val="0"/>
+          <w:numId w:val="1"/>
+        </w:numPr>
+        <w:rPr>
+          <w:rFonts w:ascii="Times New Roman" w:hAnsi="Times New Roman" w:cs="Times New Roman"/>
+          <w:lang w:val="vi-VN"/>
+        </w:rPr>
+      </w:pPr>
+      <w:r>
+        <w:rPr>
+          <w:rFonts w:ascii="Times New Roman" w:hAnsi="Times New Roman" w:cs="Times New Roman"/>
+          <w:lang w:val="vi-VN"/>
+        </w:rPr>
+        <w:t xml:space="preserve">P: </w:t>
       </w:r>
     </w:p>
     <w:p>

</xml_diff>